<commit_message>
Snapshot before restructure — add scripts, templates, CLAUDE.md, and AirOps resume
Adds pack/unpack scripts, pre-unpacked template, CLAUDE.md with full workflow
rules, AirOps and OpenAI resume outputs, and updated .gitignore to exclude
pycache, build artifacts, and .env.

Co-Authored-By: Claude Sonnet 4.6 <noreply@anthropic.com>
</commit_message>
<xml_diff>
--- a/Resumes/Stripe - Link Strategy Operations Manager - 2026-03-25.docx
+++ b/Resumes/Stripe - Link Strategy Operations Manager - 2026-03-25.docx
@@ -292,7 +292,7 @@
           <w:rFonts w:ascii="Times New Roman" w:hAnsi="Times New Roman"/>
           <w:sz w:val="20"/>
         </w:rPr>
-        <w:t>Led MaxDiff study across 65 AI use cases for product managers, mapping utility scores against workflow effectiveness to surface differentiation opportunities and inform product roadmap and GTM positioning</w:t>
+        <w:t>Built logistic regression model integrating product usage health scores with Gong call sentiment data, improving identification of high-churn-risk accounts by 20% and enabling Customer Success prioritization</w:t>
       </w:r>
     </w:p>
     <w:p>
@@ -314,7 +314,7 @@
           <w:rFonts w:ascii="Times New Roman" w:hAnsi="Times New Roman"/>
           <w:sz w:val="20"/>
         </w:rPr>
-        <w:t>Designed Looker dashboard tracking GTM and PLG motion funnels, product usage, and revenue segmentation across net new, switcher, and existing users to monitor and optimize post-launch adoption for Productboard Spark</w:t>
+        <w:t>Led MaxDiff study across 65 AI use cases for product managers, mapping utility scores against workflow effectiveness to surface differentiation opportunities and inform product roadmap and GTM positioning</w:t>
       </w:r>
     </w:p>
     <w:p>
@@ -336,7 +336,7 @@
           <w:rFonts w:ascii="Times New Roman" w:hAnsi="Times New Roman"/>
           <w:sz w:val="20"/>
         </w:rPr>
-        <w:t>Built logistic regression model integrating product usage health scores with Gong call sentiment data, improving identification of high-churn-risk accounts by 20% and enabling Customer Success prioritization</w:t>
+        <w:t>Designed Looker dashboard tracking GTM and PLG motion funnels, product usage, and revenue segmentation across net new, switcher, and existing users to monitor and optimize post-launch adoption for Productboard Spark</w:t>
       </w:r>
     </w:p>
     <w:p>
@@ -424,7 +424,7 @@
           <w:rFonts w:ascii="Times New Roman" w:hAnsi="Times New Roman"/>
           <w:sz w:val="20"/>
         </w:rPr>
-        <w:t>Redesigned HCP segmentation from 5 adoption-level tiers to 4 behavioral motivators surfaced through rep interviews, developing discovery question framework and personalized material routing that scaled from 2-territory pilot to full sales org</w:t>
+        <w:t>Redesigned HCP segmentation into 4 behavioral motivators surfaced through rep interviews, building personalized material routing framework that scaled from 2-territory pilot to full sales org</w:t>
       </w:r>
     </w:p>
     <w:p>
@@ -547,7 +547,7 @@
           <w:rFonts w:ascii="Times New Roman" w:hAnsi="Times New Roman"/>
           <w:sz w:val="20"/>
         </w:rPr>
-        <w:t>Spearheaded 0-to-1 product concept development for Marriott hotel, synthesizing market, competitive, and customer inputs to define product offering in partnership with design, driving 14% uplift in projected IRR</w:t>
+        <w:t>Designed choice-based conjoint survey and multivariate regression across 12 properties to quantify feature-level willingness to pay, translating findings into room mix and pricing strategy that delivered record ADR versus market comps</w:t>
       </w:r>
     </w:p>
     <w:p>
@@ -567,7 +567,7 @@
           <w:rFonts w:ascii="Times New Roman" w:hAnsi="Times New Roman"/>
           <w:sz w:val="20"/>
         </w:rPr>
-        <w:t>Designed choice-based conjoint survey and multivariate regression across 12 properties to quantify feature-level willingness to pay, translating findings into room mix and pricing strategy that delivered record ADR versus market comps</w:t>
+        <w:t>Spearheaded 0-to-1 product concept development for Marriott hotel, synthesizing market, competitive, and customer inputs to define product offering in partnership with design, driving 14% uplift in projected IRR</w:t>
       </w:r>
     </w:p>
     <w:p>

</xml_diff>